<commit_message>
docs: add pending docs, scripts, and updated proposal slides
</commit_message>
<xml_diff>
--- a/research_proposal_M2.docx
+++ b/research_proposal_M2.docx
@@ -396,7 +396,7 @@
           <w:sz w:val="21"/>
           <w:szCs w:val="21"/>
         </w:rPr>
-        <w:t xml:space="preserve">本研究の独創性は、議論ログ側の論証グラフと外部知識側の論証グラフを支持・攻撃エッジで連結し、一つの永続的な統合 AF として保持する点にある。関連研究は視点補完や調停を行うが、議論と知識を横断する統合的な論証グラフを持たない。また、類似度のみに依拠するフラット RAG に対し、提示情報が支持・攻撃・無関係のいずれであるかを区別する論証認識型の統合により、確証バイアスをプロンプト設計ではなくデータ構造として抑制する。さらに、介入の根拠がグラフ構造として説明可能であることは、介入の不透明性という課題への直接的な解となる。これにより、合意形成の質の向上と議論の極化抑制に対する構造的アプローチを与え、議論支援システムの社会実装上の信頼性を高めることが期待される。</w:t>
+        <w:t xml:space="preserve">本研究の独創性は、立場を持つ議論ログ側の主張（claim/premise）と、中立な事実として保持する外部知識（evidence）を、対象主張ごとの支持・攻撃エッジで連結し、一つの永続的な統合 AF として保持する点にある。外部知識は「主張」に分解せず中立な事実として扱い、その事実が各主張を支持するか攻撃するかという立場はノードではなくエッジに付与する（同じ事実が一方の主張を支持し他方を攻撃しうる）。関連研究は視点補完や調停を行うが、議論と知識を横断する統合的な論証グラフを持たない。また、類似度のみに依拠するフラット RAG に対し、提示情報が支持・攻撃・無関係のいずれであるかを区別する論証認識型の統合により、確証バイアスをプロンプト設計ではなくデータ構造として抑制する。さらに、介入の根拠がグラフ構造として説明可能であることは、介入の不透明性という課題への直接的な解となる。これにより、合意形成の質の向上と議論の極化抑制に対する構造的アプローチを与え、議論支援システムの社会実装上の信頼性を高めることが期待される。</w:t>
       </w:r>
     </w:p>
     <w:p>
@@ -433,7 +433,7 @@
           <w:sz w:val="21"/>
           <w:szCs w:val="21"/>
         </w:rPr>
-        <w:t xml:space="preserve">議論ログ側と外部知識側の双方を AF として構造化し、両者を支持・攻撃エッジで連結して単一の統合議論グラフとして保持する。この構築・運用を、論証抽出・ドキュメント知識・Web 検索・連結・ファシリテーションの五エージェントの分業として実現し、発言や情報源が入るたびにグラフをリアルタイムに更新する。論証抽出エージェントは発話を claim/premise/attack/support に分解し、ドキュメント知識エージェントは事前資料を AF として永続化（深い知識）、Web 検索エージェントは新論点をリアルタイム検索して AF ノード化（広い知識）する。連結エージェントは議論側と知識側の間に支持・攻撃エッジを推定して両者を一体化し、ファシリテーションエージェントが統合グラフ全体を読み、いつ・誰に・何を提示するかを判断する。グラフ自体は内部表現に留め、個別化通知・区切りの自然言語要約・振り返りのグラフ可視化という用途別の提示で情報を届ける。</w:t>
+        <w:t xml:space="preserve">議論ログ側は立場を持つ主張（claim/premise）として、外部知識側は中立な事実（evidence）として構造化し、事実が各主張を支持・攻撃するかを対象主張ごとのエッジで型付けして単一の統合議論グラフとして保持する。この構築・運用を、論証抽出・ドキュメント知識・Web 検索・連結・ファシリテーションの五エージェントの分業として実現し、発言や情報源が入るたびにグラフをリアルタイムに更新する。論証抽出エージェントは発話を立場を持つ claim/premise に分解し、ドキュメント知識エージェントは事前資料を中立な事実（evidence）ノードとして永続化（深い知識）、Web 検索エージェントは新論点をリアルタイム検索して事実（evidence）ノード化（広い知識）する。連結エージェントは事実と各主張の間に対象主張ごとの支持・攻撃エッジ（無関係はエッジなし）を推定して両者を一体化し、ファシリテーションエージェントが統合グラフ全体を読み、いつ・誰に・何を提示するかを判断する。グラフ自体は内部表現に留め、個別化通知・区切りの自然言語要約・振り返りのグラフ可視化という用途別の提示で情報を届ける。</w:t>
       </w:r>
     </w:p>
     <w:p>

</xml_diff>